<commit_message>
adds Refresh button for Unstable version. Also refreshes form after Retry.
</commit_message>
<xml_diff>
--- a/Source/Documentation/Online/Notifications.docx
+++ b/Source/Documentation/Online/Notifications.docx
@@ -2297,33 +2297,199 @@
       </w:r>
     </w:p>
     <w:p>
-      <w:r>
-        <w:t xml:space="preserve">The </w:t>
-      </w:r>
-      <w:r>
-        <w:t>“</w:t>
-      </w:r>
-      <w:r>
-        <w:t>Contains</w:t>
-      </w:r>
-      <w:r>
-        <w:t>”</w:t>
-      </w:r>
-      <w:r>
-        <w:t xml:space="preserve"> operator is not case-s</w:t>
-      </w:r>
-      <w:r>
-        <w:t>ensitive</w:t>
-      </w:r>
-      <w:r>
-        <w:t>.</w:t>
+      <w:pPr>
+        <w:spacing w:after="0" w:line="240" w:lineRule="auto"/>
+      </w:pPr>
+      <w:r>
+        <w:br w:type="page"/>
       </w:r>
     </w:p>
     <w:p>
       <w:r>
-        <w:t>A “ORTS.NotContains, Menu” alternative is also supported.</w:t>
+        <w:lastRenderedPageBreak/>
+        <w:t xml:space="preserve">A </w:t>
+      </w:r>
+      <w:r>
+        <w:t>family of operators can also be used for strings or integers:</w:t>
       </w:r>
     </w:p>
+    <w:tbl>
+      <w:tblPr>
+        <w:tblStyle w:val="TableGrid"/>
+        <w:tblW w:w="0" w:type="auto"/>
+        <w:tblLook w:val="04A0" w:firstRow="1" w:lastRow="0" w:firstColumn="1" w:lastColumn="0" w:noHBand="0" w:noVBand="1"/>
+      </w:tblPr>
+      <w:tblGrid>
+        <w:gridCol w:w="1384"/>
+        <w:gridCol w:w="2268"/>
+        <w:gridCol w:w="1843"/>
+      </w:tblGrid>
+      <w:tr>
+        <w:tc>
+          <w:tcPr>
+            <w:tcW w:w="1384" w:type="dxa"/>
+          </w:tcPr>
+          <w:p>
+            <w:pPr>
+              <w:jc w:val="center"/>
+            </w:pPr>
+            <w:r>
+              <w:t>Contains</w:t>
+            </w:r>
+          </w:p>
+        </w:tc>
+        <w:tc>
+          <w:tcPr>
+            <w:tcW w:w="2268" w:type="dxa"/>
+          </w:tcPr>
+          <w:p>
+            <w:pPr>
+              <w:jc w:val="center"/>
+            </w:pPr>
+            <w:r>
+              <w:t>NotContains</w:t>
+            </w:r>
+          </w:p>
+        </w:tc>
+        <w:tc>
+          <w:tcPr>
+            <w:tcW w:w="1843" w:type="dxa"/>
+          </w:tcPr>
+          <w:p>
+            <w:pPr>
+              <w:jc w:val="center"/>
+            </w:pPr>
+            <w:r>
+              <w:t>string</w:t>
+            </w:r>
+          </w:p>
+        </w:tc>
+      </w:tr>
+      <w:tr>
+        <w:tc>
+          <w:tcPr>
+            <w:tcW w:w="1384" w:type="dxa"/>
+          </w:tcPr>
+          <w:p>
+            <w:pPr>
+              <w:jc w:val="center"/>
+            </w:pPr>
+            <w:r>
+              <w:t>Equals</w:t>
+            </w:r>
+          </w:p>
+        </w:tc>
+        <w:tc>
+          <w:tcPr>
+            <w:tcW w:w="2268" w:type="dxa"/>
+          </w:tcPr>
+          <w:p>
+            <w:pPr>
+              <w:jc w:val="center"/>
+            </w:pPr>
+            <w:r>
+              <w:t>NotEquals</w:t>
+            </w:r>
+          </w:p>
+        </w:tc>
+        <w:tc>
+          <w:tcPr>
+            <w:tcW w:w="1843" w:type="dxa"/>
+          </w:tcPr>
+          <w:p>
+            <w:pPr>
+              <w:jc w:val="center"/>
+            </w:pPr>
+            <w:r>
+              <w:t>string or integer</w:t>
+            </w:r>
+          </w:p>
+        </w:tc>
+      </w:tr>
+      <w:tr>
+        <w:tc>
+          <w:tcPr>
+            <w:tcW w:w="1384" w:type="dxa"/>
+          </w:tcPr>
+          <w:p>
+            <w:pPr>
+              <w:jc w:val="center"/>
+            </w:pPr>
+            <w:r>
+              <w:t>LessThan</w:t>
+            </w:r>
+          </w:p>
+        </w:tc>
+        <w:tc>
+          <w:tcPr>
+            <w:tcW w:w="2268" w:type="dxa"/>
+          </w:tcPr>
+          <w:p>
+            <w:pPr>
+              <w:jc w:val="center"/>
+            </w:pPr>
+            <w:r>
+              <w:t>MoreThanOrEquals</w:t>
+            </w:r>
+          </w:p>
+        </w:tc>
+        <w:tc>
+          <w:tcPr>
+            <w:tcW w:w="1843" w:type="dxa"/>
+          </w:tcPr>
+          <w:p>
+            <w:pPr>
+              <w:jc w:val="center"/>
+            </w:pPr>
+            <w:r>
+              <w:t>integer</w:t>
+            </w:r>
+          </w:p>
+        </w:tc>
+      </w:tr>
+      <w:tr>
+        <w:tc>
+          <w:tcPr>
+            <w:tcW w:w="1384" w:type="dxa"/>
+          </w:tcPr>
+          <w:p>
+            <w:pPr>
+              <w:jc w:val="center"/>
+            </w:pPr>
+            <w:r>
+              <w:t>MoreThan</w:t>
+            </w:r>
+          </w:p>
+        </w:tc>
+        <w:tc>
+          <w:tcPr>
+            <w:tcW w:w="2268" w:type="dxa"/>
+          </w:tcPr>
+          <w:p>
+            <w:pPr>
+              <w:jc w:val="center"/>
+            </w:pPr>
+            <w:r>
+              <w:t>LessThanOrEquals</w:t>
+            </w:r>
+          </w:p>
+        </w:tc>
+        <w:tc>
+          <w:tcPr>
+            <w:tcW w:w="1843" w:type="dxa"/>
+          </w:tcPr>
+          <w:p>
+            <w:pPr>
+              <w:jc w:val="center"/>
+            </w:pPr>
+            <w:r>
+              <w:t>integer</w:t>
+            </w:r>
+          </w:p>
+        </w:tc>
+      </w:tr>
+    </w:tbl>
+    <w:p/>
     <w:p>
       <w:pPr>
         <w:spacing w:after="0" w:line="240" w:lineRule="auto"/>
@@ -2337,14 +2503,30 @@
         </w:rPr>
       </w:pPr>
       <w:r>
-        <w:br w:type="page"/>
+        <w:t>Note: The string operators are case-sensitive.</w:t>
       </w:r>
     </w:p>
     <w:p>
       <w:pPr>
+        <w:spacing w:after="0" w:line="240" w:lineRule="auto"/>
+        <w:rPr>
+          <w:rFonts w:cs="Arial"/>
+          <w:b/>
+          <w:bCs/>
+          <w:kern w:val="32"/>
+          <w:sz w:val="32"/>
+          <w:szCs w:val="32"/>
+        </w:rPr>
+      </w:pPr>
+      <w:bookmarkStart w:id="6" w:name="_Toc171262384"/>
+      <w:r>
+        <w:br w:type="page"/>
+      </w:r>
+    </w:p>
+    <w:p>
+      <w:pPr>
         <w:pStyle w:val="Heading1"/>
       </w:pPr>
-      <w:bookmarkStart w:id="6" w:name="_Toc171262384"/>
       <w:r>
         <w:lastRenderedPageBreak/>
         <w:t>Sample Uses</w:t>
@@ -4289,10 +4471,10 @@
           <w:noProof/>
         </w:rPr>
         <w:drawing>
-          <wp:inline distT="0" distB="0" distL="0" distR="0" wp14:anchorId="3F6BB0AD" wp14:editId="21659FFC">
-            <wp:extent cx="3077004" cy="3848637"/>
-            <wp:effectExtent l="0" t="0" r="9525" b="0"/>
-            <wp:docPr id="263624642" name="Picture 1"/>
+          <wp:inline distT="0" distB="0" distL="0" distR="0" wp14:anchorId="17D60992" wp14:editId="7FD39AF3">
+            <wp:extent cx="3505689" cy="3210373"/>
+            <wp:effectExtent l="19050" t="19050" r="0" b="9525"/>
+            <wp:docPr id="1256167826" name="Picture 1"/>
             <wp:cNvGraphicFramePr>
               <a:graphicFrameLocks xmlns:a="http://schemas.openxmlformats.org/drawingml/2006/main" noChangeAspect="1"/>
             </wp:cNvGraphicFramePr>
@@ -4300,7 +4482,7 @@
               <a:graphicData uri="http://schemas.openxmlformats.org/drawingml/2006/picture">
                 <pic:pic xmlns:pic="http://schemas.openxmlformats.org/drawingml/2006/picture">
                   <pic:nvPicPr>
-                    <pic:cNvPr id="263624642" name=""/>
+                    <pic:cNvPr id="1256167826" name=""/>
                     <pic:cNvPicPr/>
                   </pic:nvPicPr>
                   <pic:blipFill>
@@ -4312,11 +4494,16 @@
                   <pic:spPr>
                     <a:xfrm>
                       <a:off x="0" y="0"/>
-                      <a:ext cx="3077004" cy="3848637"/>
+                      <a:ext cx="3505689" cy="3210373"/>
                     </a:xfrm>
                     <a:prstGeom prst="rect">
                       <a:avLst/>
                     </a:prstGeom>
+                    <a:ln>
+                      <a:solidFill>
+                        <a:schemeClr val="accent1"/>
+                      </a:solidFill>
+                    </a:ln>
                   </pic:spPr>
                 </pic:pic>
               </a:graphicData>
@@ -5052,7 +5239,7 @@
         <w:sz w:val="20"/>
         <w:szCs w:val="20"/>
       </w:rPr>
-      <w:t>27-Jul-24</w:t>
+      <w:t>28-Jul-24</w:t>
     </w:r>
     <w:r>
       <w:rPr>
@@ -5264,7 +5451,7 @@
         <w:sz w:val="22"/>
         <w:szCs w:val="22"/>
       </w:rPr>
-      <w:t>27-Jul-24</w:t>
+      <w:t>28-Jul-24</w:t>
     </w:r>
     <w:r>
       <w:rPr>

</xml_diff>